<commit_message>
Add multinuclear ssNMR details and Further Particulars criteria
Co-Authored-By: Claude Opus 5.5 <noreply@anthropic.com>
Claude-Session: https://claude.ai/code/session_0181Py7YxLpCBh38bWHRgX5o
</commit_message>
<xml_diff>
--- a/01_documentos/coverletter-dazaet_galicia_Manchester_ssNMR_SAE-032399.docx
+++ b/01_documentos/coverletter-dazaet_galicia_Manchester_ssNMR_SAE-032399.docx
@@ -150,7 +150,7 @@
           <w:b w:val="0"/>
           <w:i w:val="0"/>
         </w:rPr>
-        <w:t>My doctoral research used solid-state NMR to measure molecular motion in organic crystals and metal-organic frameworks and to connect that motion with crystal structure and macroscopic behaviour. I acquired variable-temperature ²H and ¹³C solid-state NMR data and analysed them by lineshape simulation and relaxation analysis to obtain rotational rates and activation energies. In a pyrrolo[3,2-b]pyrrole solvate that jumps on heating (Mater. Chem. Front., 2026), I combined ²H NMR with variable-temperature single-crystal diffraction to separate the molecular dynamics from the anisotropic thermal expansion that drives the jump. In a zirconium MOF (ACS Mater. Lett., 2026), I used the same combination to follow how a photoswitch and guest uptake change the motion of a molecular rotor. Both projects were carried out with Dr Martin Dračínský and Dr Jan Blahut at IOCB Prague, and working with them taught me to use NMR and diffraction data as checks on each other.</w:t>
+        <w:t>Solid-state NMR was the central technique of my PhD. On a Bruker 500 MHz spectrometer with a double-resonance (¹H/X) MAS probe, I set up my own experiments, including tuning and matching both channels and retuning the ¹H channel for ¹⁹F. I acquired ¹³C CP-MAS spectra with variable contact times, ¹⁹F MAS spectra, variable-temperature ²H spectra and some ¹⁵N CP-MAS spectra. I simulated ²H lineshapes with NMR WebLab to obtain rotational rates and activation energies, and analysed ¹³C T₁ and ¹H and ¹⁹F relaxometry data to follow faster motions.</w:t>
       </w:r>
     </w:p>
     <w:p>
@@ -163,7 +163,7 @@
           <w:b w:val="0"/>
           <w:i w:val="0"/>
         </w:rPr>
-        <w:t>Several of the desirable criteria describe work I do routinely. I characterise molecular crystals, cocrystals and solvates by SCXRD, PXRD, DSC, TGA and hot-stage microscopy. I run DFT in Gaussian16 and periodic DFT in CP2K, use LAMMPS for molecular dynamics, and wrote two successful proposals for national supercomputing time. Multicomponent molecular crystals are already part of my work: I contributed to a study in which the salient temperature of cocrystals was tuned through the composition of the crystallisation solvent mixture (Angew. Chem. Int. Ed., 2026). Diffraction describes the average structure of a molecular solid solution, while solid-state NMR can show how each component is distributed and how it moves locally. I would very much like to work on that question within MoSS.</w:t>
+        <w:t>I use NMR together with diffraction. In a pyrrolo[3,2-b]pyrrole solvate that jumps on heating (Mater. Chem. Front., 2026), ²H NMR and variable-temperature single-crystal diffraction allowed me to separate the molecular dynamics from the anisotropic thermal expansion that drives the jump. In a zirconium MOF (ACS Mater. Lett., 2026), the same combination showed how a photoswitch and guest uptake change the motion of a molecular rotor. Both projects were done with Dr Martin Dračínský and Dr Jan Blahut at IOCB Prague.</w:t>
       </w:r>
     </w:p>
     <w:p>
@@ -176,7 +176,7 @@
           <w:b w:val="0"/>
           <w:i w:val="0"/>
         </w:rPr>
-        <w:t>My hands-on experience so far is with ²H and ¹³C. I am keen to extend it to ¹H, ¹⁵N, ¹⁹F and ¹⁷O experiments and to DNP-enhanced MAS, and the opportunity to learn these methods in your group is one of the main reasons for this application. During my PhD I learned periodic DFT and molecular dynamics from scratch and now use both in my projects, and I would approach new NMR methods in the same way.</w:t>
+        <w:t>The role also involves preparing the solid solutions, and synthesis and crystallisation are a large part of my training. I grow single crystals of molecular crystals, cocrystals and solvates and characterise them by SCXRD, PXRD, DSC, TGA and hot-stage microscopy. I contributed to a study in which the salient temperature of cocrystals was tuned through the composition of the crystallisation solvent mixture (Angew. Chem. Int. Ed., 2026). I also run DFT (Gaussian16, periodic CP2K) and molecular dynamics (LAMMPS) on HPC clusters. Diffraction gives the average structure of a molecular solid solution, while solid-state NMR can show how a dopant is distributed and how it moves locally, and this is the question I would like to work on within MoSS.</w:t>
       </w:r>
     </w:p>
     <w:p>
@@ -189,7 +189,7 @@
           <w:b w:val="0"/>
           <w:i w:val="0"/>
         </w:rPr>
-        <w:t>I enjoy working in teams spread across institutions. My 14 publications include collaborations with groups in the Czech Republic, the United States, China and the United Arab Emirates. I co-supervised four bachelor's theses and nine undergraduate research placements, and I received the Best Poster Award at DynaMIC23 in Fribourg. A consortium shared between Durham, Leeds and Manchester, with placements between sites, suits the way I like to work.</w:t>
+        <w:t>I have not yet used DNP. The UK DNP MAS NMR Facility at Manchester, and the chance to extend my work to ¹⁷O and natural-abundance ¹⁵N, are among my main reasons for applying. During my PhD I learned periodic DFT and molecular dynamics from scratch and now use both routinely, and I would approach DNP in the same way.</w:t>
       </w:r>
     </w:p>
     <w:p>
@@ -202,7 +202,7 @@
           <w:b w:val="0"/>
           <w:i w:val="0"/>
         </w:rPr>
-        <w:t>Thank you for considering my application. I would be glad to discuss it at interview.</w:t>
+        <w:t>My 14 publications include collaborations with groups in the Czech Republic, the United States, China and the United Arab Emirates. I co-supervised four bachelor's theses and nine undergraduate research placements, trained students in laboratory procedures and safety, and handled purchasing and inventory for our laboratory. I have presented 15 posters and 9 talks, and received the Best Poster Award at DynaMIC23 in Fribourg. Thank you for considering my application; I would be glad to discuss it at interview.</w:t>
       </w:r>
     </w:p>
     <w:p>
@@ -231,7 +231,7 @@
     </w:p>
     <w:sectPr>
       <w:pgSz w:w="12240" w:h="15840"/>
-      <w:pgMar w:top="1020" w:right="1134" w:bottom="1020" w:left="1134" w:header="720" w:footer="720" w:gutter="0"/>
+      <w:pgMar w:top="964" w:right="1077" w:bottom="964" w:left="1077" w:header="720" w:footer="720" w:gutter="0"/>
       <w:cols w:space="720"/>
       <w:docGrid w:linePitch="360"/>
     </w:sectPr>

</xml_diff>

<commit_message>
Rewrite covering letter from PhD thesis (v3.1); switch letter font to Aptos
Co-Authored-By: Claude Opus 5.5 <noreply@anthropic.com>
Claude-Session: https://claude.ai/code/session_016n4vxh5BsFDKEb2yDi9bDf
</commit_message>
<xml_diff>
--- a/01_documentos/coverletter-dazaet_galicia_Manchester_ssNMR_SAE-032399.docx
+++ b/01_documentos/coverletter-dazaet_galicia_Manchester_ssNMR_SAE-032399.docx
@@ -18,7 +18,7 @@
     </w:p>
     <w:p>
       <w:pPr>
-        <w:spacing w:after="0"/>
+        <w:spacing w:after="200"/>
         <w:pBdr>
           <w:bottom w:val="single" w:sz="6" w:space="1" w:color="660099"/>
         </w:pBdr>
@@ -35,12 +35,7 @@
     </w:p>
     <w:p>
       <w:pPr>
-        <w:spacing w:after="80"/>
-      </w:pPr>
-    </w:p>
-    <w:p>
-      <w:pPr>
-        <w:spacing w:after="160"/>
+        <w:spacing w:after="120"/>
       </w:pPr>
       <w:r>
         <w:rPr>
@@ -88,7 +83,7 @@
     </w:p>
     <w:p>
       <w:pPr>
-        <w:spacing w:after="0"/>
+        <w:spacing w:after="160"/>
       </w:pPr>
       <w:r>
         <w:rPr>
@@ -97,11 +92,6 @@
         </w:rPr>
         <w:t>Manchester M13 9PL, United Kingdom</w:t>
       </w:r>
-    </w:p>
-    <w:p>
-      <w:pPr>
-        <w:spacing w:after="80"/>
-      </w:pPr>
     </w:p>
     <w:p>
       <w:pPr>
@@ -129,7 +119,7 @@
     </w:p>
     <w:p>
       <w:pPr>
-        <w:spacing w:after="100"/>
+        <w:spacing w:after="80"/>
         <w:jc w:val="both"/>
       </w:pPr>
       <w:r>
@@ -137,12 +127,12 @@
           <w:b w:val="0"/>
           <w:i w:val="0"/>
         </w:rPr>
-        <w:t>I am writing to apply for the position of Research Associate in Solid-State NMR Spectroscopy (ref. SAE-032399) within the EPSRC Programme Grant on Molecular Solid Solutions. I completed my PhD in Chemical Sciences at the Institute of Chemistry, UNAM (Mexico), in 2026 under the supervision of Prof. Braulio Rodríguez-Molina, and the degree was awarded with honours.</w:t>
+        <w:t>I am applying for the position of Research Associate in Solid-State NMR Spectroscopy (ref. SAE-032399) on the EPSRC Programme Grant on Molecular Solid Solutions. I completed my PhD in Chemical Sciences at the Institute of Chemistry, UNAM (Mexico), in 2026 with Prof. Braulio Rodríguez-Molina, and the degree was awarded with honours. In my thesis I used solid-state NMR together with diffraction to relate the motion of molecules inside organic and metal-organic crystals to the behaviour of the crystal as a whole.</w:t>
       </w:r>
     </w:p>
     <w:p>
       <w:pPr>
-        <w:spacing w:after="100"/>
+        <w:spacing w:after="80"/>
         <w:jc w:val="both"/>
       </w:pPr>
       <w:r>
@@ -150,12 +140,12 @@
           <w:b w:val="0"/>
           <w:i w:val="0"/>
         </w:rPr>
-        <w:t>Solid-state NMR was the central technique of my PhD. On a Bruker 500 MHz spectrometer with a double-resonance (¹H/X) MAS probe, I set up my own experiments, including tuning and matching both channels and retuning the ¹H channel for ¹⁹F. I acquired ¹³C CP-MAS spectra with variable contact times, ¹⁹F MAS spectra, variable-temperature ²H spectra and some ¹⁵N CP-MAS spectra. I simulated ²H lineshapes with NMR WebLab to obtain rotational rates and activation energies, and analysed ¹³C T₁ and ¹H and ¹⁹F relaxometry data to follow faster motions.</w:t>
+        <w:t>The chapter closest to this project concerns a solid solution. I synthesised UiO-68-type zirconium MOFs containing a terphenyl rotor linker and an azobenzene photoswitch linker in nominal ratios from 10 to 70%. PXRD showed a single phase at every composition. Periodic DFT models (CASTEP) with the linkers in ordered positions predicted extra reflections that were absent experimentally, which indicated a random distribution of linkers within one phase. ¹³C CP-MAS confirmed that both linkers were incorporated. With a deuterated rotor linker I recorded ²H spectra between 178 and 338 K, fitted with 90° and 180° jumps above 10⁷ Hz using electric field gradients calculated in CASTEP. The rotor motion did not change with photoswitch content or irradiation. After loading hexafluorobenzene, which I confirmed by ¹⁹F MAS and quantified by ¹⁹F NMR with standard additions, the 180° jumps were suppressed and the 90° site populations depended on the photoswitch state (ACS Mater. Lett., 2026).</w:t>
       </w:r>
     </w:p>
     <w:p>
       <w:pPr>
-        <w:spacing w:after="100"/>
+        <w:spacing w:after="80"/>
         <w:jc w:val="both"/>
       </w:pPr>
       <w:r>
@@ -163,12 +153,12 @@
           <w:b w:val="0"/>
           <w:i w:val="0"/>
         </w:rPr>
-        <w:t>I use NMR together with diffraction. In a pyrrolo[3,2-b]pyrrole solvate that jumps on heating (Mater. Chem. Front., 2026), ²H NMR and variable-temperature single-crystal diffraction allowed me to separate the molecular dynamics from the anisotropic thermal expansion that drives the jump. In a zirconium MOF (ACS Mater. Lett., 2026), the same combination showed how a photoswitch and guest uptake change the motion of a molecular rotor. Both projects were done with Dr Martin Dračínský and Dr Jan Blahut at IOCB Prague.</w:t>
+        <w:t>In a toluene solvate of a pyrrolo[3,2-b]pyrrole that jumps when cooled to 77 K (Mater. Chem. Front., 2026), I prepared the toluene-d₈ analogue, recorded ²H spectra from 173 to 338 K and simulated the lineshapes in NMR WebLab with quadrupolar parameters calculated in CASTEP (GIPAW). The fit required a three-site methyl rotation and 180° ring flips, both above 10⁷ Hz at 248 K. Variable-temperature SCXRD (100 to 300 K) gave a thermal expansion coefficient of 271 MK⁻¹ oblique to the face in contact with the cold surface, and we attributed the jump to this anisotropic expansion. This work was done with Dr Martin Dračínský and Dr Jan Blahut at IOCB Prague. I also acquired the ¹³C CP-MAS and ²H data for cocrystals whose channels hold acetone and tetrahydrofuran in different ratios, where the salient temperature follows the solvent composition (Angew. Chem. Int. Ed., 2026).</w:t>
       </w:r>
     </w:p>
     <w:p>
       <w:pPr>
-        <w:spacing w:after="100"/>
+        <w:spacing w:after="80"/>
         <w:jc w:val="both"/>
       </w:pPr>
       <w:r>
@@ -176,12 +166,12 @@
           <w:b w:val="0"/>
           <w:i w:val="0"/>
         </w:rPr>
-        <w:t>The role also involves preparing the solid solutions, and synthesis and crystallisation are a large part of my training. I grow single crystals of molecular crystals, cocrystals and solvates and characterise them by SCXRD, PXRD, DSC, TGA and hot-stage microscopy. I contributed to a study in which the salient temperature of cocrystals was tuned through the composition of the crystallisation solvent mixture (Angew. Chem. Int. Ed., 2026). I also run DFT (Gaussian16, periodic CP2K) and molecular dynamics (LAMMPS) on HPC clusters. Diffraction gives the average structure of a molecular solid solution, while solid-state NMR can show how a dopant is distributed and how it moves locally, and this is the question I would like to work on within MoSS.</w:t>
+        <w:t>I ran these experiments on a Bruker 500 MHz spectrometer with a ¹H/X MAS probe, and have also acquired ³¹P and ¹⁵N CP-MAS spectra and analysed ¹³C T₁ and solid-state ¹H and ¹⁹F relaxometry data. I made the compounds in my thesis, including the deuterated analogues, and characterised them by SCXRD, PXRD, DSC and TGA. I have not yet used DNP. The UK DNP MAS NMR Facility in Manchester, and the possibility of extending this work to ¹⁷O and natural-abundance ¹⁵N, are among my main reasons for applying.</w:t>
       </w:r>
     </w:p>
     <w:p>
       <w:pPr>
-        <w:spacing w:after="100"/>
+        <w:spacing w:after="80"/>
         <w:jc w:val="both"/>
       </w:pPr>
       <w:r>
@@ -189,25 +179,12 @@
           <w:b w:val="0"/>
           <w:i w:val="0"/>
         </w:rPr>
-        <w:t>I have not yet used DNP. The UK DNP MAS NMR Facility at Manchester, and the chance to extend my work to ¹⁷O and natural-abundance ¹⁵N, are among my main reasons for applying. During my PhD I learned periodic DFT and molecular dynamics from scratch and now use both routinely, and I would approach DNP in the same way.</w:t>
+        <w:t>I have 14 publications. During my PhD I co-supervised four bachelor's theses and nine research placements and managed purchasing and inventory for our laboratory. I currently work as an Industrial Property Expert at the Mexican Institute of Industrial Property; my contract ends in December 2026 and I could start in January 2027. Thank you for considering my application.</w:t>
       </w:r>
     </w:p>
     <w:p>
       <w:pPr>
-        <w:spacing w:after="100"/>
-        <w:jc w:val="both"/>
-      </w:pPr>
-      <w:r>
-        <w:rPr>
-          <w:b w:val="0"/>
-          <w:i w:val="0"/>
-        </w:rPr>
-        <w:t>My 14 publications include collaborations with groups in the Czech Republic, the United States, China and the United Arab Emirates. I co-supervised four bachelor's theses and nine undergraduate research placements, trained students in laboratory procedures and safety, and handled purchasing and inventory for our laboratory. I have presented 15 posters and 9 talks, and received the Best Poster Award at DynaMIC23 in Fribourg. Thank you for considering my application; I would be glad to discuss it at interview.</w:t>
-      </w:r>
-    </w:p>
-    <w:p>
-      <w:pPr>
-        <w:spacing w:after="240"/>
+        <w:spacing w:after="120"/>
       </w:pPr>
       <w:r>
         <w:rPr>
@@ -231,7 +208,7 @@
     </w:p>
     <w:sectPr>
       <w:pgSz w:w="12240" w:h="15840"/>
-      <w:pgMar w:top="964" w:right="1077" w:bottom="964" w:left="1077" w:header="720" w:footer="720" w:gutter="0"/>
+      <w:pgMar w:top="794" w:right="907" w:bottom="794" w:left="907" w:header="720" w:footer="720" w:gutter="0"/>
       <w:cols w:space="720"/>
       <w:docGrid w:linePitch="360"/>
     </w:sectPr>
@@ -606,7 +583,7 @@
       <w:spacing w:after="40" w:line="259" w:lineRule="auto"/>
     </w:pPr>
     <w:rPr>
-      <w:rFonts w:ascii="Calibri" w:hAnsi="Calibri" w:eastAsia="Calibri"/>
+      <w:rFonts w:ascii="Aptos" w:hAnsi="Aptos" w:eastAsia="Aptos"/>
       <w:sz w:val="21"/>
     </w:rPr>
   </w:style>

</xml_diff>

<commit_message>
Letter: frame MOF PXRD evidence by linker length and state why ssNMR is key for same-size molecular solid solutions
Co-Authored-By: Claude Opus 5.5 <noreply@anthropic.com>
Claude-Session: https://claude.ai/code/session_016n4vxh5BsFDKEb2yDi9bDf
</commit_message>
<xml_diff>
--- a/01_documentos/coverletter-dazaet_galicia_Manchester_ssNMR_SAE-032399.docx
+++ b/01_documentos/coverletter-dazaet_galicia_Manchester_ssNMR_SAE-032399.docx
@@ -127,7 +127,7 @@
           <w:b w:val="0"/>
           <w:i w:val="0"/>
         </w:rPr>
-        <w:t>I am applying for the position of Research Associate in Solid-State NMR Spectroscopy (ref. SAE-032399) on the EPSRC Programme Grant on Molecular Solid Solutions. I completed my PhD in Chemical Sciences at the Institute of Chemistry, UNAM (Mexico), in 2026 with Prof. Braulio Rodríguez-Molina, and the degree was awarded with honours. In my thesis I used solid-state NMR together with diffraction to relate the motion of molecules inside organic and metal-organic crystals to the behaviour of the crystal as a whole.</w:t>
+        <w:t>I am applying for the position of Research Associate in Solid-State NMR Spectroscopy (ref. SAE-032399) on the EPSRC Programme Grant on Molecular Solid Solutions. I completed my PhD in Chemical Sciences at the Institute of Chemistry, UNAM (Mexico), in 2026 with Prof. Braulio Rodríguez-Molina, and the degree was awarded with honours. My thesis used solid-state NMR with diffraction to relate molecular motion in organic and metal-organic crystals to their macroscopic behaviour.</w:t>
       </w:r>
     </w:p>
     <w:p>
@@ -140,7 +140,7 @@
           <w:b w:val="0"/>
           <w:i w:val="0"/>
         </w:rPr>
-        <w:t>The chapter closest to this project concerns a solid solution. I synthesised UiO-68-type zirconium MOFs containing a terphenyl rotor linker and an azobenzene photoswitch linker in nominal ratios from 10 to 70%. PXRD showed a single phase at every composition. Periodic DFT models (CASTEP) with the linkers in ordered positions predicted extra reflections that were absent experimentally, which indicated a random distribution of linkers within one phase. ¹³C CP-MAS confirmed that both linkers were incorporated. With a deuterated rotor linker I recorded ²H spectra between 178 and 338 K, fitted with 90° and 180° jumps above 10⁷ Hz using electric field gradients calculated in CASTEP. The rotor motion did not change with photoswitch content or irradiation. After loading hexafluorobenzene, which I confirmed by ¹⁹F MAS and quantified by ¹⁹F NMR with standard additions, the 180° jumps were suppressed and the 90° site populations depended on the photoswitch state (ACS Mater. Lett., 2026).</w:t>
+        <w:t>The chapter closest to this project concerns a solid solution. I synthesised UiO-68-type zirconium MOFs containing a terphenyl rotor linker and a longer azobenzene photoswitch linker in nominal ratios from 10 to 70%. Because the linkers differ in length, the PXRD reflections, which are dominated by the Zr₆ clusters, shifted to lower angle as the photoswitch content increased, and periodic DFT models (CASTEP) with ordered linkers predicted extra reflections that were absent. Together these pointed to a random distribution of linkers within one phase. ¹³C CP-MAS confirmed that both linkers were incorporated. With a deuterated rotor linker I recorded ²H spectra between 178 and 338 K, fitted with 90° and 180° jumps above 10⁷ Hz using electric field gradients calculated in CASTEP. After loading hexafluorobenzene, which I confirmed by ¹⁹F MAS and quantified by ¹⁹F NMR with standard additions, the 180° jumps were suppressed and the 90° site populations depended on the photoswitch state (ACS Mater. Lett., 2026). In molecular solid solutions whose components have similar size and shape, diffraction will distinguish far less, and solid-state NMR becomes the main probe of how the components are distributed and how they move.</w:t>
       </w:r>
     </w:p>
     <w:p>
@@ -153,7 +153,7 @@
           <w:b w:val="0"/>
           <w:i w:val="0"/>
         </w:rPr>
-        <w:t>In a toluene solvate of a pyrrolo[3,2-b]pyrrole that jumps when cooled to 77 K (Mater. Chem. Front., 2026), I prepared the toluene-d₈ analogue, recorded ²H spectra from 173 to 338 K and simulated the lineshapes in NMR WebLab with quadrupolar parameters calculated in CASTEP (GIPAW). The fit required a three-site methyl rotation and 180° ring flips, both above 10⁷ Hz at 248 K. Variable-temperature SCXRD (100 to 300 K) gave a thermal expansion coefficient of 271 MK⁻¹ oblique to the face in contact with the cold surface, and we attributed the jump to this anisotropic expansion. This work was done with Dr Martin Dračínský and Dr Jan Blahut at IOCB Prague. I also acquired the ¹³C CP-MAS and ²H data for cocrystals whose channels hold acetone and tetrahydrofuran in different ratios, where the salient temperature follows the solvent composition (Angew. Chem. Int. Ed., 2026).</w:t>
+        <w:t>In a toluene solvate of a pyrrolo[3,2-b]pyrrole that jumps when cooled to 77 K (Mater. Chem. Front., 2026), I prepared the toluene-d₈ analogue, recorded ²H spectra from 173 to 338 K and simulated the lineshapes in NMR WebLab with quadrupolar parameters calculated in CASTEP (GIPAW). The fit required a three-site methyl rotation and 180° ring flips, both above 10⁷ Hz at 248 K. Variable-temperature SCXRD gave a thermal expansion coefficient of 271 MK⁻¹ oblique to the face in contact with the cold surface, and we attributed the jump to this anisotropic expansion. This work was done with Dr Martin Dračínský and Dr Jan Blahut at IOCB Prague. I also acquired the ¹³C CP-MAS and ²H data for cocrystals whose channels hold acetone and tetrahydrofuran in different ratios, where the salient temperature follows the solvent composition (Angew. Chem. Int. Ed., 2026).</w:t>
       </w:r>
     </w:p>
     <w:p>
@@ -166,7 +166,7 @@
           <w:b w:val="0"/>
           <w:i w:val="0"/>
         </w:rPr>
-        <w:t>I ran these experiments on a Bruker 500 MHz spectrometer with a ¹H/X MAS probe, and have also acquired ³¹P and ¹⁵N CP-MAS spectra and analysed ¹³C T₁ and solid-state ¹H and ¹⁹F relaxometry data. I made the compounds in my thesis, including the deuterated analogues, and characterised them by SCXRD, PXRD, DSC and TGA. I have not yet used DNP. The UK DNP MAS NMR Facility in Manchester, and the possibility of extending this work to ¹⁷O and natural-abundance ¹⁵N, are among my main reasons for applying.</w:t>
+        <w:t>I ran these experiments on a Bruker 500 MHz spectrometer (¹H/X MAS probe), and also acquired ³¹P and ¹⁵N CP-MAS spectra and analysed ¹³C T₁ and solid-state ¹H and ¹⁹F relaxometry data. I made the compounds in my thesis, including the deuterated analogues, and characterised them by SCXRD, PXRD, DSC and TGA. I have not yet used DNP. The UK DNP MAS NMR Facility in Manchester, and the chance to extend this work to ¹⁷O and natural-abundance ¹⁵N, are among my main reasons for applying.</w:t>
       </w:r>
     </w:p>
     <w:p>
@@ -208,7 +208,7 @@
     </w:p>
     <w:sectPr>
       <w:pgSz w:w="12240" w:h="15840"/>
-      <w:pgMar w:top="794" w:right="907" w:bottom="794" w:left="907" w:header="720" w:footer="720" w:gutter="0"/>
+      <w:pgMar w:top="737" w:right="850" w:bottom="737" w:left="850" w:header="720" w:footer="720" w:gutter="0"/>
       <w:cols w:space="720"/>
       <w:docGrid w:linePitch="360"/>
     </w:sectPr>

</xml_diff>

<commit_message>
Letter: cite Ye et al. Nat. Commun. 2025 as the case for ssNMR in same-size solid solutions; use published 2H temperature range
Co-Authored-By: Claude Opus 5.5 <noreply@anthropic.com>
Claude-Session: https://claude.ai/code/session_016n4vxh5BsFDKEb2yDi9bDf
</commit_message>
<xml_diff>
--- a/01_documentos/coverletter-dazaet_galicia_Manchester_ssNMR_SAE-032399.docx
+++ b/01_documentos/coverletter-dazaet_galicia_Manchester_ssNMR_SAE-032399.docx
@@ -140,7 +140,7 @@
           <w:b w:val="0"/>
           <w:i w:val="0"/>
         </w:rPr>
-        <w:t>The chapter closest to this project concerns a solid solution. I synthesised UiO-68-type zirconium MOFs containing a terphenyl rotor linker and a longer azobenzene photoswitch linker in nominal ratios from 10 to 70%. Because the linkers differ in length, the PXRD reflections, which are dominated by the Zr₆ clusters, shifted to lower angle as the photoswitch content increased, and periodic DFT models (CASTEP) with ordered linkers predicted extra reflections that were absent. Together these pointed to a random distribution of linkers within one phase. ¹³C CP-MAS confirmed that both linkers were incorporated. With a deuterated rotor linker I recorded ²H spectra between 178 and 338 K, fitted with 90° and 180° jumps above 10⁷ Hz using electric field gradients calculated in CASTEP. After loading hexafluorobenzene, which I confirmed by ¹⁹F MAS and quantified by ¹⁹F NMR with standard additions, the 180° jumps were suppressed and the 90° site populations depended on the photoswitch state (ACS Mater. Lett., 2026). In molecular solid solutions whose components have similar size and shape, diffraction will distinguish far less, and solid-state NMR becomes the main probe of how the components are distributed and how they move.</w:t>
+        <w:t>The chapter closest to this project concerns a solid solution. I synthesised UiO-68-type zirconium MOFs containing a terphenyl rotor linker and a longer azobenzene photoswitch linker in nominal ratios from 10 to 70%. Because the linkers differ in length, the PXRD reflections, which are dominated by the Zr₆ clusters, shifted to lower angle as the photoswitch content increased, and periodic DFT models (CASTEP) with ordered linkers predicted extra reflections that were absent. Together these pointed to a random distribution of linkers within one phase. ¹³C CP-MAS confirmed that both linkers were incorporated. With a deuterated rotor linker I recorded ²H spectra between 178 and 338 K, fitted with 90° and 180° jumps above 10⁷ Hz using electric field gradients calculated in CASTEP. After loading hexafluorobenzene, which I confirmed by ¹⁹F MAS and quantified by ¹⁹F NMR with standard additions, the 180° jumps were suppressed and the 90° site populations depended on the photoswitch state (ACS Mater. Lett., 2026). When the components have similar size, as in the 9-anthraldehyde/9-methylanthracene solid solutions of Ye et al. (Nat. Commun., 2025), the unit cell barely changes with composition, and the composition and statistical distribution were obtained after dissolution or from photoproduct ratios. Solid-state NMR can measure both in the intact crystal, and this is the problem I would like to work on within MoSS.</w:t>
       </w:r>
     </w:p>
     <w:p>
@@ -153,7 +153,7 @@
           <w:b w:val="0"/>
           <w:i w:val="0"/>
         </w:rPr>
-        <w:t>In a toluene solvate of a pyrrolo[3,2-b]pyrrole that jumps when cooled to 77 K (Mater. Chem. Front., 2026), I prepared the toluene-d₈ analogue, recorded ²H spectra from 173 to 338 K and simulated the lineshapes in NMR WebLab with quadrupolar parameters calculated in CASTEP (GIPAW). The fit required a three-site methyl rotation and 180° ring flips, both above 10⁷ Hz at 248 K. Variable-temperature SCXRD gave a thermal expansion coefficient of 271 MK⁻¹ oblique to the face in contact with the cold surface, and we attributed the jump to this anisotropic expansion. This work was done with Dr Martin Dračínský and Dr Jan Blahut at IOCB Prague. I also acquired the ¹³C CP-MAS and ²H data for cocrystals whose channels hold acetone and tetrahydrofuran in different ratios, where the salient temperature follows the solvent composition (Angew. Chem. Int. Ed., 2026).</w:t>
+        <w:t>In a toluene solvate of a pyrrolo[3,2-b]pyrrole that jumps when cooled to 77 K (Mater. Chem. Front., 2026), I prepared the toluene-d₈ analogue, recorded ²H spectra from 178 to 338 K and simulated the lineshapes in NMR WebLab with quadrupolar parameters calculated in CASTEP (GIPAW), which showed methyl rotation and 180° ring flips above 10⁷ Hz. Variable-temperature SCXRD gave a thermal expansion coefficient of 271 MK⁻¹ oblique to the face in contact with the cold surface, and we attributed the jump to this anisotropic expansion (with Dr Martin Dračínský and Dr Jan Blahut, IOCB Prague). I also acquired the ¹³C CP-MAS and ²H data for cocrystals whose channels hold acetone and tetrahydrofuran in different ratios, where the salient temperature follows the solvent composition (Angew. Chem. Int. Ed., 2026).</w:t>
       </w:r>
     </w:p>
     <w:p>

</xml_diff>

<commit_message>
Letter: correct roles per paper, drop external reference, 173 K; add CLAUDE.md with application rules
Co-Authored-By: Claude Opus 5.5 <noreply@anthropic.com>
Claude-Session: https://claude.ai/code/session_016n4vxh5BsFDKEb2yDi9bDf
</commit_message>
<xml_diff>
--- a/01_documentos/coverletter-dazaet_galicia_Manchester_ssNMR_SAE-032399.docx
+++ b/01_documentos/coverletter-dazaet_galicia_Manchester_ssNMR_SAE-032399.docx
@@ -140,7 +140,7 @@
           <w:b w:val="0"/>
           <w:i w:val="0"/>
         </w:rPr>
-        <w:t>The chapter closest to this project concerns a solid solution. I synthesised UiO-68-type zirconium MOFs containing a terphenyl rotor linker and a longer azobenzene photoswitch linker in nominal ratios from 10 to 70%. Because the linkers differ in length, the PXRD reflections, which are dominated by the Zr₆ clusters, shifted to lower angle as the photoswitch content increased, and periodic DFT models (CASTEP) with ordered linkers predicted extra reflections that were absent. Together these pointed to a random distribution of linkers within one phase. ¹³C CP-MAS confirmed that both linkers were incorporated. With a deuterated rotor linker I recorded ²H spectra between 178 and 338 K, fitted with 90° and 180° jumps above 10⁷ Hz using electric field gradients calculated in CASTEP. After loading hexafluorobenzene, which I confirmed by ¹⁹F MAS and quantified by ¹⁹F NMR with standard additions, the 180° jumps were suppressed and the 90° site populations depended on the photoswitch state (ACS Mater. Lett., 2026). When the components have similar size, as in the 9-anthraldehyde/9-methylanthracene solid solutions of Ye et al. (Nat. Commun., 2025), the unit cell barely changes with composition, and the composition and statistical distribution were obtained after dissolution or from photoproduct ratios. Solid-state NMR can measure both in the intact crystal, and this is the problem I would like to work on within MoSS.</w:t>
+        <w:t>The chapter closest to this project concerns a solid solution. I synthesised UiO-68-type zirconium MOFs containing a terphenyl rotor linker and a longer azobenzene photoswitch linker in nominal ratios from 10 to 70%. Because the linkers differ in length, the PXRD reflections, which are dominated by the Zr₆ clusters, shifted to lower angle as the photoswitch content increased. I built periodic DFT models in CASTEP with the linkers in ordered positions, and their calculated patterns contained extra reflections that were absent experimentally, which pointed to a random distribution of linkers within one phase. ¹³C CP-MAS confirmed that both linkers were incorporated. With a deuterated rotor linker I recorded ²H spectra between 178 and 338 K, which were fitted with 90° and 180° jumps above 10⁷ Hz using electric field gradients calculated in CASTEP. After loading hexafluorobenzene, which I confirmed by ¹⁹F MAS and quantified by ¹⁹F NMR with standard additions, the 180° jumps were suppressed and the 90° site populations depended on the photoswitch state (ACS Mater. Lett., 2026). In molecular solid solutions whose components have similar size, diffraction changes much less with composition, and the local environment around each nucleus seen by solid-state NMR becomes the main source of information.</w:t>
       </w:r>
     </w:p>
     <w:p>
@@ -153,7 +153,7 @@
           <w:b w:val="0"/>
           <w:i w:val="0"/>
         </w:rPr>
-        <w:t>In a toluene solvate of a pyrrolo[3,2-b]pyrrole that jumps when cooled to 77 K (Mater. Chem. Front., 2026), I prepared the toluene-d₈ analogue, recorded ²H spectra from 178 to 338 K and simulated the lineshapes in NMR WebLab with quadrupolar parameters calculated in CASTEP (GIPAW), which showed methyl rotation and 180° ring flips above 10⁷ Hz. Variable-temperature SCXRD gave a thermal expansion coefficient of 271 MK⁻¹ oblique to the face in contact with the cold surface, and we attributed the jump to this anisotropic expansion (with Dr Martin Dračínský and Dr Jan Blahut, IOCB Prague). I also acquired the ¹³C CP-MAS and ²H data for cocrystals whose channels hold acetone and tetrahydrofuran in different ratios, where the salient temperature follows the solvent composition (Angew. Chem. Int. Ed., 2026).</w:t>
+        <w:t>In a toluene solvate of a pyrrolo[3,2-b]pyrrole that jumps when cooled to 77 K (Mater. Chem. Front., 2026), I prepared the toluene-d₈ analogue, recorded ²H spectra from 173 to 338 K and simulated the lineshapes in NMR WebLab with quadrupolar parameters calculated in CASTEP (GIPAW), which showed methyl rotation and 180° ring flips above 10⁷ Hz. Variable-temperature SCXRD gave a thermal expansion coefficient of 271 MK⁻¹ oblique to the face in contact with the cold surface, and we attributed the jump to this anisotropic expansion (with Dr Martin Dračínský and Dr Jan Blahut, IOCB Prague). In collaborative work, I interpreted and modelled the ²H spectra of acetone and tetrahydrofuran in mixed-solvate cocrystals (Angew. Chem. Int. Ed., 2026) and of a guest-loaded zirconium MOF (Chem. Sci., 2020), and interpreted the ¹³C CP-MAS data of a thermosalient crystal (Chem. Mater., 2025).</w:t>
       </w:r>
     </w:p>
     <w:p>

</xml_diff>

<commit_message>
Letter and CV: remove CASTEP as own work, state NMR responsibility across all papers, use published 178 K; update rules
Co-Authored-By: Claude Opus 5.5 <noreply@anthropic.com>
Claude-Session: https://claude.ai/code/session_016n4vxh5BsFDKEb2yDi9bDf
</commit_message>
<xml_diff>
--- a/01_documentos/coverletter-dazaet_galicia_Manchester_ssNMR_SAE-032399.docx
+++ b/01_documentos/coverletter-dazaet_galicia_Manchester_ssNMR_SAE-032399.docx
@@ -119,7 +119,7 @@
     </w:p>
     <w:p>
       <w:pPr>
-        <w:spacing w:after="80"/>
+        <w:spacing w:after="60"/>
         <w:jc w:val="both"/>
       </w:pPr>
       <w:r>
@@ -132,7 +132,7 @@
     </w:p>
     <w:p>
       <w:pPr>
-        <w:spacing w:after="80"/>
+        <w:spacing w:after="60"/>
         <w:jc w:val="both"/>
       </w:pPr>
       <w:r>
@@ -140,12 +140,12 @@
           <w:b w:val="0"/>
           <w:i w:val="0"/>
         </w:rPr>
-        <w:t>The chapter closest to this project concerns a solid solution. I synthesised UiO-68-type zirconium MOFs containing a terphenyl rotor linker and a longer azobenzene photoswitch linker in nominal ratios from 10 to 70%. Because the linkers differ in length, the PXRD reflections, which are dominated by the Zr₆ clusters, shifted to lower angle as the photoswitch content increased. I built periodic DFT models in CASTEP with the linkers in ordered positions, and their calculated patterns contained extra reflections that were absent experimentally, which pointed to a random distribution of linkers within one phase. ¹³C CP-MAS confirmed that both linkers were incorporated. With a deuterated rotor linker I recorded ²H spectra between 178 and 338 K, which were fitted with 90° and 180° jumps above 10⁷ Hz using electric field gradients calculated in CASTEP. After loading hexafluorobenzene, which I confirmed by ¹⁹F MAS and quantified by ¹⁹F NMR with standard additions, the 180° jumps were suppressed and the 90° site populations depended on the photoswitch state (ACS Mater. Lett., 2026). In molecular solid solutions whose components have similar size, diffraction changes much less with composition, and the local environment around each nucleus seen by solid-state NMR becomes the main source of information.</w:t>
+        <w:t>The chapter closest to this project concerns a solid solution. I synthesised UiO-68-type zirconium MOFs containing a terphenyl rotor linker and a longer azobenzene photoswitch linker in nominal ratios from 10 to 70%. Because the linkers differ in length, the PXRD reflections, which are dominated by the Zr₆ clusters, shifted to lower angle as the photoswitch content increased. I built periodic models with the linkers in ordered positions, and the calculated patterns of the DFT-optimised models contained extra reflections that were absent experimentally, which pointed to a random distribution of linkers within one phase. ¹³C CP-MAS confirmed that both linkers were incorporated. With a deuterated rotor linker I recorded ²H spectra between 178 and 338 K, which were fitted with 90° and 180° jumps above 10⁷ Hz using electric field gradients calculated in CASTEP. After loading hexafluorobenzene, which I confirmed by ¹⁹F MAS and quantified by ¹⁹F NMR with standard additions, the 180° jumps were suppressed and the 90° site populations depended on the photoswitch state (ACS Mater. Lett., 2026). In molecular solid solutions of similar-sized components, diffraction changes little with composition, and the local environment seen by solid-state NMR becomes the main source of information.</w:t>
       </w:r>
     </w:p>
     <w:p>
       <w:pPr>
-        <w:spacing w:after="80"/>
+        <w:spacing w:after="60"/>
         <w:jc w:val="both"/>
       </w:pPr>
       <w:r>
@@ -153,12 +153,12 @@
           <w:b w:val="0"/>
           <w:i w:val="0"/>
         </w:rPr>
-        <w:t>In a toluene solvate of a pyrrolo[3,2-b]pyrrole that jumps when cooled to 77 K (Mater. Chem. Front., 2026), I prepared the toluene-d₈ analogue, recorded ²H spectra from 173 to 338 K and simulated the lineshapes in NMR WebLab with quadrupolar parameters calculated in CASTEP (GIPAW), which showed methyl rotation and 180° ring flips above 10⁷ Hz. Variable-temperature SCXRD gave a thermal expansion coefficient of 271 MK⁻¹ oblique to the face in contact with the cold surface, and we attributed the jump to this anisotropic expansion (with Dr Martin Dračínský and Dr Jan Blahut, IOCB Prague). In collaborative work, I interpreted and modelled the ²H spectra of acetone and tetrahydrofuran in mixed-solvate cocrystals (Angew. Chem. Int. Ed., 2026) and of a guest-loaded zirconium MOF (Chem. Sci., 2020), and interpreted the ¹³C CP-MAS data of a thermosalient crystal (Chem. Mater., 2025).</w:t>
+        <w:t>In a toluene solvate of a pyrrolo[3,2-b]pyrrole that jumps when cooled to 77 K (Mater. Chem. Front., 2026), I prepared the toluene-d₈ analogue and simulated in NMR WebLab the ²H lineshapes recorded from 178 to 338 K, using quadrupolar parameters from GIPAW calculations, which showed methyl rotation and 180° ring flips above 10⁷ Hz. Variable-temperature SCXRD gave a thermal expansion coefficient of 271 MK⁻¹ oblique to the face in contact with the cold surface, and we attributed the jump to this anisotropic expansion (with Dr Martin Dračínský and Dr Jan Blahut, IOCB Prague). I was responsible for the NMR analysis, in solution and in the solid state, in all 14 of my publications. For example, I interpreted and modelled the ²H spectra of acetone and tetrahydrofuran in mixed-solvate cocrystals (Angew. Chem. Int. Ed., 2026) and of a guest-loaded zirconium MOF (Chem. Sci., 2020), and interpreted the ¹³C CP-MAS data of a thermosalient crystal (Chem. Mater., 2025).</w:t>
       </w:r>
     </w:p>
     <w:p>
       <w:pPr>
-        <w:spacing w:after="80"/>
+        <w:spacing w:after="60"/>
         <w:jc w:val="both"/>
       </w:pPr>
       <w:r>
@@ -166,12 +166,12 @@
           <w:b w:val="0"/>
           <w:i w:val="0"/>
         </w:rPr>
-        <w:t>I ran my own experiments on a Bruker 500 MHz spectrometer (¹H/X MAS probe), and also acquired ³¹P and ¹⁵N CP-MAS spectra and analysed ¹³C T₁ and solid-state ¹H and ¹⁹F relaxometry data. I made the compounds in my thesis, including the deuterated analogues, and characterised them by SCXRD, PXRD, DSC and TGA. I have not yet used DNP. The UK DNP MAS NMR Facility in Manchester, and the chance to extend this work to ¹⁷O and natural-abundance ¹⁵N, are among my main reasons for applying.</w:t>
+        <w:t>I ran my own experiments on a Bruker 500 MHz spectrometer, from acquisition to interpretation and modelling, and also acquired ³¹P and ¹⁵N CP-MAS spectra and analysed ¹³C T₁ and solid-state ¹H and ¹⁹F relaxometry data. I made the compounds in my thesis, including the deuterated analogues, and characterised them by SCXRD, PXRD, DSC and TGA. I have not yet used DNP. The UK DNP MAS NMR Facility in Manchester, and the chance to extend this work to ¹⁷O and natural-abundance ¹⁵N, are among my main reasons for applying.</w:t>
       </w:r>
     </w:p>
     <w:p>
       <w:pPr>
-        <w:spacing w:after="80"/>
+        <w:spacing w:after="60"/>
         <w:jc w:val="both"/>
       </w:pPr>
       <w:r>
@@ -179,12 +179,12 @@
           <w:b w:val="0"/>
           <w:i w:val="0"/>
         </w:rPr>
-        <w:t>I have 14 publications. During my PhD I co-supervised four bachelor's theses and nine research placements and managed purchasing and inventory for our laboratory. I currently work as an Industrial Property Expert at the Mexican Institute of Industrial Property; my contract ends in December 2026 and I could start in January 2027. Thank you for considering my application.</w:t>
+        <w:t>I co-supervised four bachelor's theses and nine research placements and managed purchasing and inventory for our laboratory. I currently work at the Mexican Institute of Industrial Property until December 2026 and could start in January 2027. Thank you for considering my application.</w:t>
       </w:r>
     </w:p>
     <w:p>
       <w:pPr>
-        <w:spacing w:after="120"/>
+        <w:spacing w:after="40"/>
       </w:pPr>
       <w:r>
         <w:rPr>
@@ -208,7 +208,7 @@
     </w:p>
     <w:sectPr>
       <w:pgSz w:w="12240" w:h="15840"/>
-      <w:pgMar w:top="737" w:right="850" w:bottom="737" w:left="850" w:header="720" w:footer="720" w:gutter="0"/>
+      <w:pgMar w:top="680" w:right="794" w:bottom="680" w:left="794" w:header="720" w:footer="720" w:gutter="0"/>
       <w:cols w:space="720"/>
       <w:docGrid w:linePitch="360"/>
     </w:sectPr>

</xml_diff>